<commit_message>
feat: add metric benchmark evaluation pipeline
</commit_message>
<xml_diff>
--- a/reports/da2k_reproduction.docx
+++ b/reports/da2k_reproduction.docx
@@ -3755,6 +3755,30 @@
     </w:p>
     <w:p>
       <w:pPr>
+        <w:pStyle w:val="Heading2"/>
+      </w:pPr>
+      <w:r>
+        <w:t>Milestone status</w:t>
+      </w:r>
+    </w:p>
+    <w:p>
+      <w:pPr>
+        <w:spacing w:after="120"/>
+      </w:pPr>
+      <w:r>
+        <w:t>This completes the DA-2K stage of the reproduction: the dataset was acquired and preprocessed, all three public student checkpoints were evaluated, the results were compared against the paper, and the generated artifacts were hashed for verification.</w:t>
+      </w:r>
+    </w:p>
+    <w:p>
+      <w:pPr>
+        <w:spacing w:after="120"/>
+      </w:pPr>
+      <w:r>
+        <w:t>KITTI and NYU Depth V2 have already been downloaded locally and are ready to seed the next stage. They are not counted as completed evaluations in this report because they require a separate metric-depth pipeline: benchmark-specific preprocessing, valid-mask handling, crop/alignment rules, and metrics such as AbsRel, RMSE, and delta1.</w:t>
+      </w:r>
+    </w:p>
+    <w:p>
+      <w:pPr>
         <w:spacing w:before="280" w:after="80"/>
       </w:pPr>
       <w:r>

</xml_diff>

<commit_message>
Add full evaluation pipeline: data prep, pixelwise evaluation, and reports
</commit_message>
<xml_diff>
--- a/reports/da2k_reproduction.docx
+++ b/reports/da2k_reproduction.docx
@@ -42,7 +42,7 @@
           <w:color w:val="808080"/>
           <w:sz w:val="20"/>
         </w:rPr>
-        <w:t>2026-05-07 06:54 UTC</w:t>
+        <w:t>2026-05-19 21:30 UTC</w:t>
       </w:r>
     </w:p>
     <w:p>
@@ -3755,30 +3755,6 @@
     </w:p>
     <w:p>
       <w:pPr>
-        <w:pStyle w:val="Heading2"/>
-      </w:pPr>
-      <w:r>
-        <w:t>Milestone status</w:t>
-      </w:r>
-    </w:p>
-    <w:p>
-      <w:pPr>
-        <w:spacing w:after="120"/>
-      </w:pPr>
-      <w:r>
-        <w:t>This completes the DA-2K stage of the reproduction: the dataset was acquired and preprocessed, all three public student checkpoints were evaluated, the results were compared against the paper, and the generated artifacts were hashed for verification.</w:t>
-      </w:r>
-    </w:p>
-    <w:p>
-      <w:pPr>
-        <w:spacing w:after="120"/>
-      </w:pPr>
-      <w:r>
-        <w:t>KITTI and NYU Depth V2 have already been downloaded locally and are ready to seed the next stage. They are not counted as completed evaluations in this report because they require a separate metric-depth pipeline: benchmark-specific preprocessing, valid-mask handling, crop/alignment rules, and metrics such as AbsRel, RMSE, and delta1.</w:t>
-      </w:r>
-    </w:p>
-    <w:p>
-      <w:pPr>
         <w:spacing w:before="280" w:after="80"/>
       </w:pPr>
       <w:r>

</xml_diff>